<commit_message>
Update thesis materials and moderation title
</commit_message>
<xml_diff>
--- a/Пояснительная записка/Афонькин М.А. ВКР черновик v7.docx
+++ b/Пояснительная записка/Афонькин М.А. ВКР черновик v7.docx
@@ -5,6 +5,8 @@
     <w:p>
       <w:pPr>
         <w:pStyle w:val="1"/>
+        <w:ind w:firstLine="0"/>
+        <w:jc w:val="center"/>
         <w:rPr>
           <w:lang w:val="ru-RU"/>
         </w:rPr>
@@ -27,103 +29,14 @@
         <w:rPr>
           <w:lang w:val="ru-RU"/>
         </w:rPr>
-        <w:t>ВВЕДЕНИЕ ........................................ ____</w:t>
-      </w:r>
-    </w:p>
-    <w:p>
-      <w:pPr>
-        <w:rPr>
-          <w:lang w:val="ru-RU"/>
-        </w:rPr>
-      </w:pPr>
-      <w:r>
-        <w:rPr>
-          <w:lang w:val="ru-RU"/>
-        </w:rPr>
-        <w:t>1 Теоретические основы и анализ существующих решений рецензирования музыкального творчества ........................................ ____</w:t>
-      </w:r>
-    </w:p>
-    <w:p>
-      <w:pPr>
-        <w:rPr>
-          <w:lang w:val="ru-RU"/>
-        </w:rPr>
-      </w:pPr>
-      <w:r>
-        <w:rPr>
-          <w:lang w:val="ru-RU"/>
-        </w:rPr>
-        <w:t>2 Проектирование и разработка информационной системы рецензирования музыкального творчества ........................................ ____</w:t>
-      </w:r>
-    </w:p>
-    <w:p>
-      <w:pPr>
-        <w:rPr>
-          <w:lang w:val="ru-RU"/>
-        </w:rPr>
-      </w:pPr>
-      <w:r>
-        <w:rPr>
-          <w:lang w:val="ru-RU"/>
-        </w:rPr>
-        <w:t>3 Результаты опытной эксплуатации и проверка работоспособности системы ........................................ ____</w:t>
-      </w:r>
-    </w:p>
-    <w:p>
-      <w:pPr>
-        <w:rPr>
-          <w:lang w:val="ru-RU"/>
-        </w:rPr>
-      </w:pPr>
-      <w:r>
-        <w:rPr>
-          <w:lang w:val="ru-RU"/>
-        </w:rPr>
-        <w:t>ЗАКЛЮЧЕНИЕ ........................................ ____</w:t>
-      </w:r>
-    </w:p>
-    <w:p>
-      <w:pPr>
-        <w:rPr>
-          <w:lang w:val="ru-RU"/>
-        </w:rPr>
-      </w:pPr>
-      <w:r>
-        <w:rPr>
-          <w:lang w:val="ru-RU"/>
-        </w:rPr>
-        <w:t>СПИСОК ИСПОЛЬЗОВАННЫХ ИСТОЧНИКОВ ........................................ ____</w:t>
-      </w:r>
-    </w:p>
-    <w:p>
-      <w:pPr>
-        <w:rPr>
-          <w:lang w:val="ru-RU"/>
-        </w:rPr>
-      </w:pPr>
-      <w:r>
-        <w:rPr>
-          <w:lang w:val="ru-RU"/>
-        </w:rPr>
-        <w:t>ПРИЛОЖЕНИЯ ........................................ ____</w:t>
-      </w:r>
-    </w:p>
-    <w:p>
-      <w:pPr>
-        <w:rPr>
-          <w:lang w:val="ru-RU"/>
-        </w:rPr>
-      </w:pPr>
-      <w:r>
-        <w:rPr>
-          <w:lang w:val="ru-RU"/>
-        </w:rPr>
         <w:br w:type="page"/>
       </w:r>
     </w:p>
     <w:p>
       <w:pPr>
         <w:pStyle w:val="1"/>
+        <w:ind w:firstLine="0"/>
+        <w:jc w:val="center"/>
         <w:rPr>
           <w:lang w:val="ru-RU"/>
         </w:rPr>
@@ -3106,8 +3019,8 @@
         <w:tblLook w:val="04A0" w:firstRow="1" w:lastRow="0" w:firstColumn="1" w:lastColumn="0" w:noHBand="0" w:noVBand="1"/>
       </w:tblPr>
       <w:tblGrid>
-        <w:gridCol w:w="4986"/>
-        <w:gridCol w:w="4986"/>
+        <w:gridCol w:w="4536"/>
+        <w:gridCol w:w="5436"/>
       </w:tblGrid>
       <w:tr>
         <w:trPr>
@@ -3116,7 +3029,7 @@
         </w:trPr>
         <w:tc>
           <w:tcPr>
-            <w:tcW w:w="4986" w:type="dxa"/>
+            <w:tcW w:w="4536" w:type="dxa"/>
             <w:tcBorders>
               <w:top w:val="single" w:sz="6" w:space="0" w:color="BFB3A0"/>
               <w:left w:val="single" w:sz="6" w:space="0" w:color="BFB3A0"/>
@@ -3166,7 +3079,7 @@
         </w:tc>
         <w:tc>
           <w:tcPr>
-            <w:tcW w:w="4986" w:type="dxa"/>
+            <w:tcW w:w="5436" w:type="dxa"/>
             <w:tcBorders>
               <w:top w:val="single" w:sz="6" w:space="0" w:color="BFB3A0"/>
               <w:left w:val="single" w:sz="6" w:space="0" w:color="BFB3A0"/>
@@ -3221,7 +3134,7 @@
         </w:trPr>
         <w:tc>
           <w:tcPr>
-            <w:tcW w:w="4986" w:type="dxa"/>
+            <w:tcW w:w="4536" w:type="dxa"/>
             <w:tcBorders>
               <w:top w:val="single" w:sz="6" w:space="0" w:color="BFB3A0"/>
               <w:left w:val="single" w:sz="6" w:space="0" w:color="BFB3A0"/>
@@ -3256,7 +3169,7 @@
         </w:tc>
         <w:tc>
           <w:tcPr>
-            <w:tcW w:w="4986" w:type="dxa"/>
+            <w:tcW w:w="5436" w:type="dxa"/>
             <w:tcBorders>
               <w:top w:val="single" w:sz="6" w:space="0" w:color="BFB3A0"/>
               <w:left w:val="single" w:sz="6" w:space="0" w:color="BFB3A0"/>
@@ -3296,7 +3209,7 @@
         </w:trPr>
         <w:tc>
           <w:tcPr>
-            <w:tcW w:w="4986" w:type="dxa"/>
+            <w:tcW w:w="4536" w:type="dxa"/>
             <w:tcBorders>
               <w:top w:val="single" w:sz="6" w:space="0" w:color="BFB3A0"/>
               <w:left w:val="single" w:sz="6" w:space="0" w:color="BFB3A0"/>
@@ -3331,7 +3244,7 @@
         </w:tc>
         <w:tc>
           <w:tcPr>
-            <w:tcW w:w="4986" w:type="dxa"/>
+            <w:tcW w:w="5436" w:type="dxa"/>
             <w:tcBorders>
               <w:top w:val="single" w:sz="6" w:space="0" w:color="BFB3A0"/>
               <w:left w:val="single" w:sz="6" w:space="0" w:color="BFB3A0"/>
@@ -3371,7 +3284,7 @@
         </w:trPr>
         <w:tc>
           <w:tcPr>
-            <w:tcW w:w="4986" w:type="dxa"/>
+            <w:tcW w:w="4536" w:type="dxa"/>
             <w:tcBorders>
               <w:top w:val="single" w:sz="6" w:space="0" w:color="BFB3A0"/>
               <w:left w:val="single" w:sz="6" w:space="0" w:color="BFB3A0"/>
@@ -3406,7 +3319,7 @@
         </w:tc>
         <w:tc>
           <w:tcPr>
-            <w:tcW w:w="4986" w:type="dxa"/>
+            <w:tcW w:w="5436" w:type="dxa"/>
             <w:tcBorders>
               <w:top w:val="single" w:sz="6" w:space="0" w:color="BFB3A0"/>
               <w:left w:val="single" w:sz="6" w:space="0" w:color="BFB3A0"/>
@@ -3446,7 +3359,7 @@
         </w:trPr>
         <w:tc>
           <w:tcPr>
-            <w:tcW w:w="4986" w:type="dxa"/>
+            <w:tcW w:w="4536" w:type="dxa"/>
             <w:tcBorders>
               <w:top w:val="single" w:sz="6" w:space="0" w:color="BFB3A0"/>
               <w:left w:val="single" w:sz="6" w:space="0" w:color="BFB3A0"/>
@@ -3481,7 +3394,7 @@
         </w:tc>
         <w:tc>
           <w:tcPr>
-            <w:tcW w:w="4986" w:type="dxa"/>
+            <w:tcW w:w="5436" w:type="dxa"/>
             <w:tcBorders>
               <w:top w:val="single" w:sz="6" w:space="0" w:color="BFB3A0"/>
               <w:left w:val="single" w:sz="6" w:space="0" w:color="BFB3A0"/>
@@ -3521,7 +3434,7 @@
         </w:trPr>
         <w:tc>
           <w:tcPr>
-            <w:tcW w:w="4986" w:type="dxa"/>
+            <w:tcW w:w="4536" w:type="dxa"/>
             <w:tcBorders>
               <w:top w:val="single" w:sz="6" w:space="0" w:color="BFB3A0"/>
               <w:left w:val="single" w:sz="6" w:space="0" w:color="BFB3A0"/>
@@ -3556,7 +3469,7 @@
         </w:tc>
         <w:tc>
           <w:tcPr>
-            <w:tcW w:w="4986" w:type="dxa"/>
+            <w:tcW w:w="5436" w:type="dxa"/>
             <w:tcBorders>
               <w:top w:val="single" w:sz="6" w:space="0" w:color="BFB3A0"/>
               <w:left w:val="single" w:sz="6" w:space="0" w:color="BFB3A0"/>
@@ -3585,15 +3498,7 @@
                 <w:sz w:val="24"/>
                 <w:lang w:val="ru-RU"/>
               </w:rPr>
-              <w:t xml:space="preserve">Система открывает страницу соответствующего музыкального объекта с </w:t>
-            </w:r>
-            <w:r>
-              <w:rPr>
-                <w:sz w:val="24"/>
-                <w:lang w:val="ru-RU"/>
-              </w:rPr>
-              <w:lastRenderedPageBreak/>
-              <w:t>подробной информацией</w:t>
+              <w:t>Система открывает страницу соответствующего музыкального объекта с подробной информацией</w:t>
             </w:r>
           </w:p>
         </w:tc>
@@ -3618,6 +3523,7 @@
         <w:rPr>
           <w:lang w:val="ru-RU"/>
         </w:rPr>
+        <w:lastRenderedPageBreak/>
         <w:t>Ключевой пользовательский сценарий начинается с выбора альбома или трека, просмотра существующих оценок и создания собственной рецензии. После публикации материал может быть отправлен на модерацию, а после одобрения появляется в общей ленте и участвует в расчете средних оценок.</w:t>
       </w:r>
     </w:p>
@@ -3725,33 +3631,33 @@
           <w:rFonts w:ascii="Times New Roman" w:eastAsia="Times New Roman" w:hAnsi="Times New Roman"/>
           <w:lang w:val="ru-RU"/>
         </w:rPr>
+        <w:t>2.3 Проектирование базы данных</w:t>
+      </w:r>
+    </w:p>
+    <w:p>
+      <w:pPr>
+        <w:rPr>
+          <w:lang w:val="ru-RU"/>
+        </w:rPr>
+      </w:pPr>
+      <w:r>
+        <w:rPr>
+          <w:lang w:val="ru-RU"/>
+        </w:rPr>
+        <w:t>Модель данных включает сущности пользователей, альбомов, треков, жанров, рецензий, лайков, подписок и пользовательских предпочтений. Центральной сущностью является рецензия, которая связывает автора, оцениваемый альбом или трек, текстовое описание и набор числовых критериев.</w:t>
+      </w:r>
+    </w:p>
+    <w:p>
+      <w:pPr>
+        <w:rPr>
+          <w:lang w:val="ru-RU"/>
+        </w:rPr>
+      </w:pPr>
+      <w:r>
+        <w:rPr>
+          <w:lang w:val="ru-RU"/>
+        </w:rPr>
         <w:lastRenderedPageBreak/>
-        <w:t>2.3 Проектирование базы данных</w:t>
-      </w:r>
-    </w:p>
-    <w:p>
-      <w:pPr>
-        <w:rPr>
-          <w:lang w:val="ru-RU"/>
-        </w:rPr>
-      </w:pPr>
-      <w:r>
-        <w:rPr>
-          <w:lang w:val="ru-RU"/>
-        </w:rPr>
-        <w:t>Модель данных включает сущности пользователей, альбомов, треков, жанров, рецензий, лайков, подписок и пользовательских предпочтений. Центральной сущностью является рецензия, которая связывает автора, оцениваемый альбом или трек, текстовое описание и набор числовых критериев.</w:t>
-      </w:r>
-    </w:p>
-    <w:p>
-      <w:pPr>
-        <w:rPr>
-          <w:lang w:val="ru-RU"/>
-        </w:rPr>
-      </w:pPr>
-      <w:r>
-        <w:rPr>
-          <w:lang w:val="ru-RU"/>
-        </w:rPr>
         <w:t xml:space="preserve">Пользовательская модель хранит учетные данные, признак администратора, публичную информацию профиля, ссылки на социальные сети, избранные альбомы, треки и артистов. Пароль пользователя хранится не в открытом виде, а как </w:t>
       </w:r>
       <w:proofErr w:type="spellStart"/>
@@ -5178,8 +5084,8 @@
         <w:tblLook w:val="04A0" w:firstRow="1" w:lastRow="0" w:firstColumn="1" w:lastColumn="0" w:noHBand="0" w:noVBand="1"/>
       </w:tblPr>
       <w:tblGrid>
-        <w:gridCol w:w="3324"/>
-        <w:gridCol w:w="3324"/>
+        <w:gridCol w:w="3119"/>
+        <w:gridCol w:w="3529"/>
         <w:gridCol w:w="3324"/>
       </w:tblGrid>
       <w:tr>
@@ -5189,7 +5095,7 @@
         </w:trPr>
         <w:tc>
           <w:tcPr>
-            <w:tcW w:w="3324" w:type="dxa"/>
+            <w:tcW w:w="3119" w:type="dxa"/>
             <w:tcBorders>
               <w:top w:val="single" w:sz="6" w:space="0" w:color="BFB3A0"/>
               <w:left w:val="single" w:sz="6" w:space="0" w:color="BFB3A0"/>
@@ -5217,6 +5123,56 @@
                 <w:sz w:val="24"/>
               </w:rPr>
               <w:t>Критерий</w:t>
+            </w:r>
+            <w:proofErr w:type="spellEnd"/>
+          </w:p>
+        </w:tc>
+        <w:tc>
+          <w:tcPr>
+            <w:tcW w:w="3529" w:type="dxa"/>
+            <w:tcBorders>
+              <w:top w:val="single" w:sz="6" w:space="0" w:color="BFB3A0"/>
+              <w:left w:val="single" w:sz="6" w:space="0" w:color="BFB3A0"/>
+              <w:bottom w:val="single" w:sz="6" w:space="0" w:color="BFB3A0"/>
+              <w:right w:val="single" w:sz="6" w:space="0" w:color="BFB3A0"/>
+            </w:tcBorders>
+            <w:tcMar>
+              <w:top w:w="90" w:type="dxa"/>
+              <w:left w:w="90" w:type="dxa"/>
+              <w:bottom w:w="90" w:type="dxa"/>
+              <w:right w:w="90" w:type="dxa"/>
+            </w:tcMar>
+            <w:vAlign w:val="center"/>
+          </w:tcPr>
+          <w:p>
+            <w:pPr>
+              <w:spacing w:line="240" w:lineRule="auto"/>
+              <w:ind w:firstLine="0"/>
+              <w:jc w:val="left"/>
+            </w:pPr>
+            <w:proofErr w:type="spellStart"/>
+            <w:r>
+              <w:rPr>
+                <w:b/>
+                <w:sz w:val="24"/>
+              </w:rPr>
+              <w:t>Содержание</w:t>
+            </w:r>
+            <w:proofErr w:type="spellEnd"/>
+            <w:r>
+              <w:rPr>
+                <w:b/>
+                <w:sz w:val="24"/>
+              </w:rPr>
+              <w:t xml:space="preserve"> </w:t>
+            </w:r>
+            <w:proofErr w:type="spellStart"/>
+            <w:r>
+              <w:rPr>
+                <w:b/>
+                <w:sz w:val="24"/>
+              </w:rPr>
+              <w:t>критерия</w:t>
             </w:r>
             <w:proofErr w:type="spellEnd"/>
           </w:p>
@@ -5250,7 +5206,7 @@
                 <w:b/>
                 <w:sz w:val="24"/>
               </w:rPr>
-              <w:t>Содержание</w:t>
+              <w:t>Назначение</w:t>
             </w:r>
             <w:proofErr w:type="spellEnd"/>
             <w:r>
@@ -5258,7 +5214,7 @@
                 <w:b/>
                 <w:sz w:val="24"/>
               </w:rPr>
-              <w:t xml:space="preserve"> </w:t>
+              <w:t xml:space="preserve"> в </w:t>
             </w:r>
             <w:proofErr w:type="spellStart"/>
             <w:r>
@@ -5266,9 +5222,96 @@
                 <w:b/>
                 <w:sz w:val="24"/>
               </w:rPr>
-              <w:t>критерия</w:t>
+              <w:t>интерфейсе</w:t>
             </w:r>
             <w:proofErr w:type="spellEnd"/>
+          </w:p>
+        </w:tc>
+      </w:tr>
+      <w:tr>
+        <w:trPr>
+          <w:jc w:val="center"/>
+        </w:trPr>
+        <w:tc>
+          <w:tcPr>
+            <w:tcW w:w="3119" w:type="dxa"/>
+            <w:tcBorders>
+              <w:top w:val="single" w:sz="6" w:space="0" w:color="BFB3A0"/>
+              <w:left w:val="single" w:sz="6" w:space="0" w:color="BFB3A0"/>
+              <w:bottom w:val="single" w:sz="6" w:space="0" w:color="BFB3A0"/>
+              <w:right w:val="single" w:sz="6" w:space="0" w:color="BFB3A0"/>
+            </w:tcBorders>
+            <w:tcMar>
+              <w:top w:w="90" w:type="dxa"/>
+              <w:left w:w="90" w:type="dxa"/>
+              <w:bottom w:w="90" w:type="dxa"/>
+              <w:right w:w="90" w:type="dxa"/>
+            </w:tcMar>
+            <w:vAlign w:val="center"/>
+          </w:tcPr>
+          <w:p>
+            <w:pPr>
+              <w:spacing w:line="240" w:lineRule="auto"/>
+              <w:ind w:firstLine="0"/>
+              <w:jc w:val="left"/>
+            </w:pPr>
+            <w:proofErr w:type="spellStart"/>
+            <w:r>
+              <w:rPr>
+                <w:sz w:val="24"/>
+              </w:rPr>
+              <w:t>Рифмы</w:t>
+            </w:r>
+            <w:proofErr w:type="spellEnd"/>
+            <w:r>
+              <w:rPr>
+                <w:sz w:val="24"/>
+              </w:rPr>
+              <w:t xml:space="preserve"> и </w:t>
+            </w:r>
+            <w:proofErr w:type="spellStart"/>
+            <w:r>
+              <w:rPr>
+                <w:sz w:val="24"/>
+              </w:rPr>
+              <w:t>образы</w:t>
+            </w:r>
+            <w:proofErr w:type="spellEnd"/>
+          </w:p>
+        </w:tc>
+        <w:tc>
+          <w:tcPr>
+            <w:tcW w:w="3529" w:type="dxa"/>
+            <w:tcBorders>
+              <w:top w:val="single" w:sz="6" w:space="0" w:color="BFB3A0"/>
+              <w:left w:val="single" w:sz="6" w:space="0" w:color="BFB3A0"/>
+              <w:bottom w:val="single" w:sz="6" w:space="0" w:color="BFB3A0"/>
+              <w:right w:val="single" w:sz="6" w:space="0" w:color="BFB3A0"/>
+            </w:tcBorders>
+            <w:tcMar>
+              <w:top w:w="90" w:type="dxa"/>
+              <w:left w:w="90" w:type="dxa"/>
+              <w:bottom w:w="90" w:type="dxa"/>
+              <w:right w:w="90" w:type="dxa"/>
+            </w:tcMar>
+            <w:vAlign w:val="center"/>
+          </w:tcPr>
+          <w:p>
+            <w:pPr>
+              <w:spacing w:line="240" w:lineRule="auto"/>
+              <w:ind w:firstLine="0"/>
+              <w:jc w:val="left"/>
+              <w:rPr>
+                <w:lang w:val="ru-RU"/>
+              </w:rPr>
+            </w:pPr>
+            <w:r>
+              <w:rPr>
+                <w:sz w:val="24"/>
+                <w:lang w:val="ru-RU"/>
+              </w:rPr>
+              <w:t>Оценивает выразительность текста, метафоры, запоминающиеся формулировки и работу с образностью</w:t>
+            </w:r>
           </w:p>
         </w:tc>
         <w:tc>
@@ -5293,32 +5336,17 @@
               <w:spacing w:line="240" w:lineRule="auto"/>
               <w:ind w:firstLine="0"/>
               <w:jc w:val="left"/>
+              <w:rPr>
+                <w:lang w:val="ru-RU"/>
+              </w:rPr>
             </w:pPr>
-            <w:proofErr w:type="spellStart"/>
-            <w:r>
-              <w:rPr>
-                <w:b/>
-                <w:sz w:val="24"/>
-              </w:rPr>
-              <w:t>Назначение</w:t>
-            </w:r>
-            <w:proofErr w:type="spellEnd"/>
-            <w:r>
-              <w:rPr>
-                <w:b/>
-                <w:sz w:val="24"/>
-              </w:rPr>
-              <w:t xml:space="preserve"> в </w:t>
-            </w:r>
-            <w:proofErr w:type="spellStart"/>
-            <w:r>
-              <w:rPr>
-                <w:b/>
-                <w:sz w:val="24"/>
-              </w:rPr>
-              <w:t>интерфейсе</w:t>
-            </w:r>
-            <w:proofErr w:type="spellEnd"/>
+            <w:r>
+              <w:rPr>
+                <w:sz w:val="24"/>
+                <w:lang w:val="ru-RU"/>
+              </w:rPr>
+              <w:t>Показывает литературную составляющую рецензируемого материала</w:t>
+            </w:r>
           </w:p>
         </w:tc>
       </w:tr>
@@ -5328,7 +5356,7 @@
         </w:trPr>
         <w:tc>
           <w:tcPr>
-            <w:tcW w:w="3324" w:type="dxa"/>
+            <w:tcW w:w="3119" w:type="dxa"/>
             <w:tcBorders>
               <w:top w:val="single" w:sz="6" w:space="0" w:color="BFB3A0"/>
               <w:left w:val="single" w:sz="6" w:space="0" w:color="BFB3A0"/>
@@ -5354,7 +5382,7 @@
               <w:rPr>
                 <w:sz w:val="24"/>
               </w:rPr>
-              <w:t>Рифмы</w:t>
+              <w:t>Структура</w:t>
             </w:r>
             <w:proofErr w:type="spellEnd"/>
             <w:r>
@@ -5368,9 +5396,44 @@
               <w:rPr>
                 <w:sz w:val="24"/>
               </w:rPr>
-              <w:t>образы</w:t>
+              <w:t>ритмика</w:t>
             </w:r>
             <w:proofErr w:type="spellEnd"/>
+          </w:p>
+        </w:tc>
+        <w:tc>
+          <w:tcPr>
+            <w:tcW w:w="3529" w:type="dxa"/>
+            <w:tcBorders>
+              <w:top w:val="single" w:sz="6" w:space="0" w:color="BFB3A0"/>
+              <w:left w:val="single" w:sz="6" w:space="0" w:color="BFB3A0"/>
+              <w:bottom w:val="single" w:sz="6" w:space="0" w:color="BFB3A0"/>
+              <w:right w:val="single" w:sz="6" w:space="0" w:color="BFB3A0"/>
+            </w:tcBorders>
+            <w:tcMar>
+              <w:top w:w="90" w:type="dxa"/>
+              <w:left w:w="90" w:type="dxa"/>
+              <w:bottom w:w="90" w:type="dxa"/>
+              <w:right w:w="90" w:type="dxa"/>
+            </w:tcMar>
+            <w:vAlign w:val="center"/>
+          </w:tcPr>
+          <w:p>
+            <w:pPr>
+              <w:spacing w:line="240" w:lineRule="auto"/>
+              <w:ind w:firstLine="0"/>
+              <w:jc w:val="left"/>
+              <w:rPr>
+                <w:lang w:val="ru-RU"/>
+              </w:rPr>
+            </w:pPr>
+            <w:r>
+              <w:rPr>
+                <w:sz w:val="24"/>
+                <w:lang w:val="ru-RU"/>
+              </w:rPr>
+              <w:t>Учитывает композицию трека, развитие куплетов, припевов, переходов и ритмическую устойчивость</w:t>
+            </w:r>
           </w:p>
         </w:tc>
         <w:tc>
@@ -5404,7 +5467,94 @@
                 <w:sz w:val="24"/>
                 <w:lang w:val="ru-RU"/>
               </w:rPr>
-              <w:t>Оценивает выразительность текста, метафоры, запоминающиеся формулировки и работу с образностью</w:t>
+              <w:t>Позволяет отделить общее впечатление от технической организации материала</w:t>
+            </w:r>
+          </w:p>
+        </w:tc>
+      </w:tr>
+      <w:tr>
+        <w:trPr>
+          <w:jc w:val="center"/>
+        </w:trPr>
+        <w:tc>
+          <w:tcPr>
+            <w:tcW w:w="3119" w:type="dxa"/>
+            <w:tcBorders>
+              <w:top w:val="single" w:sz="6" w:space="0" w:color="BFB3A0"/>
+              <w:left w:val="single" w:sz="6" w:space="0" w:color="BFB3A0"/>
+              <w:bottom w:val="single" w:sz="6" w:space="0" w:color="BFB3A0"/>
+              <w:right w:val="single" w:sz="6" w:space="0" w:color="BFB3A0"/>
+            </w:tcBorders>
+            <w:tcMar>
+              <w:top w:w="90" w:type="dxa"/>
+              <w:left w:w="90" w:type="dxa"/>
+              <w:bottom w:w="90" w:type="dxa"/>
+              <w:right w:w="90" w:type="dxa"/>
+            </w:tcMar>
+            <w:vAlign w:val="center"/>
+          </w:tcPr>
+          <w:p>
+            <w:pPr>
+              <w:spacing w:line="240" w:lineRule="auto"/>
+              <w:ind w:firstLine="0"/>
+              <w:jc w:val="left"/>
+            </w:pPr>
+            <w:proofErr w:type="spellStart"/>
+            <w:r>
+              <w:rPr>
+                <w:sz w:val="24"/>
+              </w:rPr>
+              <w:t>Реализация</w:t>
+            </w:r>
+            <w:proofErr w:type="spellEnd"/>
+            <w:r>
+              <w:rPr>
+                <w:sz w:val="24"/>
+              </w:rPr>
+              <w:t xml:space="preserve"> </w:t>
+            </w:r>
+            <w:proofErr w:type="spellStart"/>
+            <w:r>
+              <w:rPr>
+                <w:sz w:val="24"/>
+              </w:rPr>
+              <w:t>стиля</w:t>
+            </w:r>
+            <w:proofErr w:type="spellEnd"/>
+          </w:p>
+        </w:tc>
+        <w:tc>
+          <w:tcPr>
+            <w:tcW w:w="3529" w:type="dxa"/>
+            <w:tcBorders>
+              <w:top w:val="single" w:sz="6" w:space="0" w:color="BFB3A0"/>
+              <w:left w:val="single" w:sz="6" w:space="0" w:color="BFB3A0"/>
+              <w:bottom w:val="single" w:sz="6" w:space="0" w:color="BFB3A0"/>
+              <w:right w:val="single" w:sz="6" w:space="0" w:color="BFB3A0"/>
+            </w:tcBorders>
+            <w:tcMar>
+              <w:top w:w="90" w:type="dxa"/>
+              <w:left w:w="90" w:type="dxa"/>
+              <w:bottom w:w="90" w:type="dxa"/>
+              <w:right w:w="90" w:type="dxa"/>
+            </w:tcMar>
+            <w:vAlign w:val="center"/>
+          </w:tcPr>
+          <w:p>
+            <w:pPr>
+              <w:spacing w:line="240" w:lineRule="auto"/>
+              <w:ind w:firstLine="0"/>
+              <w:jc w:val="left"/>
+              <w:rPr>
+                <w:lang w:val="ru-RU"/>
+              </w:rPr>
+            </w:pPr>
+            <w:r>
+              <w:rPr>
+                <w:sz w:val="24"/>
+                <w:lang w:val="ru-RU"/>
+              </w:rPr>
+              <w:t>Отражает, насколько произведение уверенно работает внутри выбранного жанра и эстетики</w:t>
             </w:r>
           </w:p>
         </w:tc>
@@ -5439,7 +5589,7 @@
                 <w:sz w:val="24"/>
                 <w:lang w:val="ru-RU"/>
               </w:rPr>
-              <w:t>Показывает литературную составляющую рецензируемого материала</w:t>
+              <w:t>Помогает сравнивать релизы внутри жанрового контекста</w:t>
             </w:r>
           </w:p>
         </w:tc>
@@ -5450,7 +5600,7 @@
         </w:trPr>
         <w:tc>
           <w:tcPr>
-            <w:tcW w:w="3324" w:type="dxa"/>
+            <w:tcW w:w="3119" w:type="dxa"/>
             <w:tcBorders>
               <w:top w:val="single" w:sz="6" w:space="0" w:color="BFB3A0"/>
               <w:left w:val="single" w:sz="6" w:space="0" w:color="BFB3A0"/>
@@ -5476,7 +5626,7 @@
               <w:rPr>
                 <w:sz w:val="24"/>
               </w:rPr>
-              <w:t>Структура</w:t>
+              <w:t>Индивидуальность</w:t>
             </w:r>
             <w:proofErr w:type="spellEnd"/>
             <w:r>
@@ -5490,9 +5640,44 @@
               <w:rPr>
                 <w:sz w:val="24"/>
               </w:rPr>
-              <w:t>ритмика</w:t>
+              <w:t>харизма</w:t>
             </w:r>
             <w:proofErr w:type="spellEnd"/>
+          </w:p>
+        </w:tc>
+        <w:tc>
+          <w:tcPr>
+            <w:tcW w:w="3529" w:type="dxa"/>
+            <w:tcBorders>
+              <w:top w:val="single" w:sz="6" w:space="0" w:color="BFB3A0"/>
+              <w:left w:val="single" w:sz="6" w:space="0" w:color="BFB3A0"/>
+              <w:bottom w:val="single" w:sz="6" w:space="0" w:color="BFB3A0"/>
+              <w:right w:val="single" w:sz="6" w:space="0" w:color="BFB3A0"/>
+            </w:tcBorders>
+            <w:tcMar>
+              <w:top w:w="90" w:type="dxa"/>
+              <w:left w:w="90" w:type="dxa"/>
+              <w:bottom w:w="90" w:type="dxa"/>
+              <w:right w:w="90" w:type="dxa"/>
+            </w:tcMar>
+            <w:vAlign w:val="center"/>
+          </w:tcPr>
+          <w:p>
+            <w:pPr>
+              <w:spacing w:line="240" w:lineRule="auto"/>
+              <w:ind w:firstLine="0"/>
+              <w:jc w:val="left"/>
+              <w:rPr>
+                <w:lang w:val="ru-RU"/>
+              </w:rPr>
+            </w:pPr>
+            <w:r>
+              <w:rPr>
+                <w:sz w:val="24"/>
+                <w:lang w:val="ru-RU"/>
+              </w:rPr>
+              <w:t>Оценивает узнаваемость автора, подачу, характер исполнения и отличие от типовых решений</w:t>
+            </w:r>
           </w:p>
         </w:tc>
         <w:tc>
@@ -5526,7 +5711,94 @@
                 <w:sz w:val="24"/>
                 <w:lang w:val="ru-RU"/>
               </w:rPr>
-              <w:t>Учитывает композицию трека, развитие куплетов, припевов, переходов и ритмическую устойчивость</w:t>
+              <w:t>Подчеркивает авторскую составляющую музыкального произведения</w:t>
+            </w:r>
+          </w:p>
+        </w:tc>
+      </w:tr>
+      <w:tr>
+        <w:trPr>
+          <w:jc w:val="center"/>
+        </w:trPr>
+        <w:tc>
+          <w:tcPr>
+            <w:tcW w:w="3119" w:type="dxa"/>
+            <w:tcBorders>
+              <w:top w:val="single" w:sz="6" w:space="0" w:color="BFB3A0"/>
+              <w:left w:val="single" w:sz="6" w:space="0" w:color="BFB3A0"/>
+              <w:bottom w:val="single" w:sz="6" w:space="0" w:color="BFB3A0"/>
+              <w:right w:val="single" w:sz="6" w:space="0" w:color="BFB3A0"/>
+            </w:tcBorders>
+            <w:tcMar>
+              <w:top w:w="90" w:type="dxa"/>
+              <w:left w:w="90" w:type="dxa"/>
+              <w:bottom w:w="90" w:type="dxa"/>
+              <w:right w:w="90" w:type="dxa"/>
+            </w:tcMar>
+            <w:vAlign w:val="center"/>
+          </w:tcPr>
+          <w:p>
+            <w:pPr>
+              <w:spacing w:line="240" w:lineRule="auto"/>
+              <w:ind w:firstLine="0"/>
+              <w:jc w:val="left"/>
+            </w:pPr>
+            <w:proofErr w:type="spellStart"/>
+            <w:r>
+              <w:rPr>
+                <w:sz w:val="24"/>
+              </w:rPr>
+              <w:t>Атмосфера</w:t>
+            </w:r>
+            <w:proofErr w:type="spellEnd"/>
+            <w:r>
+              <w:rPr>
+                <w:sz w:val="24"/>
+              </w:rPr>
+              <w:t xml:space="preserve"> и </w:t>
+            </w:r>
+            <w:proofErr w:type="spellStart"/>
+            <w:r>
+              <w:rPr>
+                <w:sz w:val="24"/>
+              </w:rPr>
+              <w:t>вайб</w:t>
+            </w:r>
+            <w:proofErr w:type="spellEnd"/>
+          </w:p>
+        </w:tc>
+        <w:tc>
+          <w:tcPr>
+            <w:tcW w:w="3529" w:type="dxa"/>
+            <w:tcBorders>
+              <w:top w:val="single" w:sz="6" w:space="0" w:color="BFB3A0"/>
+              <w:left w:val="single" w:sz="6" w:space="0" w:color="BFB3A0"/>
+              <w:bottom w:val="single" w:sz="6" w:space="0" w:color="BFB3A0"/>
+              <w:right w:val="single" w:sz="6" w:space="0" w:color="BFB3A0"/>
+            </w:tcBorders>
+            <w:tcMar>
+              <w:top w:w="90" w:type="dxa"/>
+              <w:left w:w="90" w:type="dxa"/>
+              <w:bottom w:w="90" w:type="dxa"/>
+              <w:right w:w="90" w:type="dxa"/>
+            </w:tcMar>
+            <w:vAlign w:val="center"/>
+          </w:tcPr>
+          <w:p>
+            <w:pPr>
+              <w:spacing w:line="240" w:lineRule="auto"/>
+              <w:ind w:firstLine="0"/>
+              <w:jc w:val="left"/>
+              <w:rPr>
+                <w:lang w:val="ru-RU"/>
+              </w:rPr>
+            </w:pPr>
+            <w:r>
+              <w:rPr>
+                <w:sz w:val="24"/>
+                <w:lang w:val="ru-RU"/>
+              </w:rPr>
+              <w:t>Отражает цельность эмоционального впечатления и способность релиза удерживать настроение</w:t>
             </w:r>
           </w:p>
         </w:tc>
@@ -5561,381 +5833,6 @@
                 <w:sz w:val="24"/>
                 <w:lang w:val="ru-RU"/>
               </w:rPr>
-              <w:t>Позволяет отделить общее впечатление от технической организации материала</w:t>
-            </w:r>
-          </w:p>
-        </w:tc>
-      </w:tr>
-      <w:tr>
-        <w:trPr>
-          <w:jc w:val="center"/>
-        </w:trPr>
-        <w:tc>
-          <w:tcPr>
-            <w:tcW w:w="3324" w:type="dxa"/>
-            <w:tcBorders>
-              <w:top w:val="single" w:sz="6" w:space="0" w:color="BFB3A0"/>
-              <w:left w:val="single" w:sz="6" w:space="0" w:color="BFB3A0"/>
-              <w:bottom w:val="single" w:sz="6" w:space="0" w:color="BFB3A0"/>
-              <w:right w:val="single" w:sz="6" w:space="0" w:color="BFB3A0"/>
-            </w:tcBorders>
-            <w:tcMar>
-              <w:top w:w="90" w:type="dxa"/>
-              <w:left w:w="90" w:type="dxa"/>
-              <w:bottom w:w="90" w:type="dxa"/>
-              <w:right w:w="90" w:type="dxa"/>
-            </w:tcMar>
-            <w:vAlign w:val="center"/>
-          </w:tcPr>
-          <w:p>
-            <w:pPr>
-              <w:spacing w:line="240" w:lineRule="auto"/>
-              <w:ind w:firstLine="0"/>
-              <w:jc w:val="left"/>
-            </w:pPr>
-            <w:proofErr w:type="spellStart"/>
-            <w:r>
-              <w:rPr>
-                <w:sz w:val="24"/>
-              </w:rPr>
-              <w:t>Реализация</w:t>
-            </w:r>
-            <w:proofErr w:type="spellEnd"/>
-            <w:r>
-              <w:rPr>
-                <w:sz w:val="24"/>
-              </w:rPr>
-              <w:t xml:space="preserve"> </w:t>
-            </w:r>
-            <w:proofErr w:type="spellStart"/>
-            <w:r>
-              <w:rPr>
-                <w:sz w:val="24"/>
-              </w:rPr>
-              <w:t>стиля</w:t>
-            </w:r>
-            <w:proofErr w:type="spellEnd"/>
-          </w:p>
-        </w:tc>
-        <w:tc>
-          <w:tcPr>
-            <w:tcW w:w="3324" w:type="dxa"/>
-            <w:tcBorders>
-              <w:top w:val="single" w:sz="6" w:space="0" w:color="BFB3A0"/>
-              <w:left w:val="single" w:sz="6" w:space="0" w:color="BFB3A0"/>
-              <w:bottom w:val="single" w:sz="6" w:space="0" w:color="BFB3A0"/>
-              <w:right w:val="single" w:sz="6" w:space="0" w:color="BFB3A0"/>
-            </w:tcBorders>
-            <w:tcMar>
-              <w:top w:w="90" w:type="dxa"/>
-              <w:left w:w="90" w:type="dxa"/>
-              <w:bottom w:w="90" w:type="dxa"/>
-              <w:right w:w="90" w:type="dxa"/>
-            </w:tcMar>
-            <w:vAlign w:val="center"/>
-          </w:tcPr>
-          <w:p>
-            <w:pPr>
-              <w:spacing w:line="240" w:lineRule="auto"/>
-              <w:ind w:firstLine="0"/>
-              <w:jc w:val="left"/>
-              <w:rPr>
-                <w:lang w:val="ru-RU"/>
-              </w:rPr>
-            </w:pPr>
-            <w:r>
-              <w:rPr>
-                <w:sz w:val="24"/>
-                <w:lang w:val="ru-RU"/>
-              </w:rPr>
-              <w:t>Отражает, насколько произведение уверенно работает внутри выбранного жанра и эстетики</w:t>
-            </w:r>
-          </w:p>
-        </w:tc>
-        <w:tc>
-          <w:tcPr>
-            <w:tcW w:w="3324" w:type="dxa"/>
-            <w:tcBorders>
-              <w:top w:val="single" w:sz="6" w:space="0" w:color="BFB3A0"/>
-              <w:left w:val="single" w:sz="6" w:space="0" w:color="BFB3A0"/>
-              <w:bottom w:val="single" w:sz="6" w:space="0" w:color="BFB3A0"/>
-              <w:right w:val="single" w:sz="6" w:space="0" w:color="BFB3A0"/>
-            </w:tcBorders>
-            <w:tcMar>
-              <w:top w:w="90" w:type="dxa"/>
-              <w:left w:w="90" w:type="dxa"/>
-              <w:bottom w:w="90" w:type="dxa"/>
-              <w:right w:w="90" w:type="dxa"/>
-            </w:tcMar>
-            <w:vAlign w:val="center"/>
-          </w:tcPr>
-          <w:p>
-            <w:pPr>
-              <w:spacing w:line="240" w:lineRule="auto"/>
-              <w:ind w:firstLine="0"/>
-              <w:jc w:val="left"/>
-              <w:rPr>
-                <w:lang w:val="ru-RU"/>
-              </w:rPr>
-            </w:pPr>
-            <w:r>
-              <w:rPr>
-                <w:sz w:val="24"/>
-                <w:lang w:val="ru-RU"/>
-              </w:rPr>
-              <w:t>Помогает сравнивать релизы внутри жанрового контекста</w:t>
-            </w:r>
-          </w:p>
-        </w:tc>
-      </w:tr>
-      <w:tr>
-        <w:trPr>
-          <w:jc w:val="center"/>
-        </w:trPr>
-        <w:tc>
-          <w:tcPr>
-            <w:tcW w:w="3324" w:type="dxa"/>
-            <w:tcBorders>
-              <w:top w:val="single" w:sz="6" w:space="0" w:color="BFB3A0"/>
-              <w:left w:val="single" w:sz="6" w:space="0" w:color="BFB3A0"/>
-              <w:bottom w:val="single" w:sz="6" w:space="0" w:color="BFB3A0"/>
-              <w:right w:val="single" w:sz="6" w:space="0" w:color="BFB3A0"/>
-            </w:tcBorders>
-            <w:tcMar>
-              <w:top w:w="90" w:type="dxa"/>
-              <w:left w:w="90" w:type="dxa"/>
-              <w:bottom w:w="90" w:type="dxa"/>
-              <w:right w:w="90" w:type="dxa"/>
-            </w:tcMar>
-            <w:vAlign w:val="center"/>
-          </w:tcPr>
-          <w:p>
-            <w:pPr>
-              <w:spacing w:line="240" w:lineRule="auto"/>
-              <w:ind w:firstLine="0"/>
-              <w:jc w:val="left"/>
-            </w:pPr>
-            <w:proofErr w:type="spellStart"/>
-            <w:r>
-              <w:rPr>
-                <w:sz w:val="24"/>
-              </w:rPr>
-              <w:t>Индивидуальность</w:t>
-            </w:r>
-            <w:proofErr w:type="spellEnd"/>
-            <w:r>
-              <w:rPr>
-                <w:sz w:val="24"/>
-              </w:rPr>
-              <w:t xml:space="preserve"> и </w:t>
-            </w:r>
-            <w:proofErr w:type="spellStart"/>
-            <w:r>
-              <w:rPr>
-                <w:sz w:val="24"/>
-              </w:rPr>
-              <w:t>харизма</w:t>
-            </w:r>
-            <w:proofErr w:type="spellEnd"/>
-          </w:p>
-        </w:tc>
-        <w:tc>
-          <w:tcPr>
-            <w:tcW w:w="3324" w:type="dxa"/>
-            <w:tcBorders>
-              <w:top w:val="single" w:sz="6" w:space="0" w:color="BFB3A0"/>
-              <w:left w:val="single" w:sz="6" w:space="0" w:color="BFB3A0"/>
-              <w:bottom w:val="single" w:sz="6" w:space="0" w:color="BFB3A0"/>
-              <w:right w:val="single" w:sz="6" w:space="0" w:color="BFB3A0"/>
-            </w:tcBorders>
-            <w:tcMar>
-              <w:top w:w="90" w:type="dxa"/>
-              <w:left w:w="90" w:type="dxa"/>
-              <w:bottom w:w="90" w:type="dxa"/>
-              <w:right w:w="90" w:type="dxa"/>
-            </w:tcMar>
-            <w:vAlign w:val="center"/>
-          </w:tcPr>
-          <w:p>
-            <w:pPr>
-              <w:spacing w:line="240" w:lineRule="auto"/>
-              <w:ind w:firstLine="0"/>
-              <w:jc w:val="left"/>
-              <w:rPr>
-                <w:lang w:val="ru-RU"/>
-              </w:rPr>
-            </w:pPr>
-            <w:r>
-              <w:rPr>
-                <w:sz w:val="24"/>
-                <w:lang w:val="ru-RU"/>
-              </w:rPr>
-              <w:t>Оценивает узнаваемость автора, подачу, характер исполнения и отличие от типовых решений</w:t>
-            </w:r>
-          </w:p>
-        </w:tc>
-        <w:tc>
-          <w:tcPr>
-            <w:tcW w:w="3324" w:type="dxa"/>
-            <w:tcBorders>
-              <w:top w:val="single" w:sz="6" w:space="0" w:color="BFB3A0"/>
-              <w:left w:val="single" w:sz="6" w:space="0" w:color="BFB3A0"/>
-              <w:bottom w:val="single" w:sz="6" w:space="0" w:color="BFB3A0"/>
-              <w:right w:val="single" w:sz="6" w:space="0" w:color="BFB3A0"/>
-            </w:tcBorders>
-            <w:tcMar>
-              <w:top w:w="90" w:type="dxa"/>
-              <w:left w:w="90" w:type="dxa"/>
-              <w:bottom w:w="90" w:type="dxa"/>
-              <w:right w:w="90" w:type="dxa"/>
-            </w:tcMar>
-            <w:vAlign w:val="center"/>
-          </w:tcPr>
-          <w:p>
-            <w:pPr>
-              <w:spacing w:line="240" w:lineRule="auto"/>
-              <w:ind w:firstLine="0"/>
-              <w:jc w:val="left"/>
-              <w:rPr>
-                <w:lang w:val="ru-RU"/>
-              </w:rPr>
-            </w:pPr>
-            <w:r>
-              <w:rPr>
-                <w:sz w:val="24"/>
-                <w:lang w:val="ru-RU"/>
-              </w:rPr>
-              <w:t>Подчеркивает авторскую составляющую музыкального произведения</w:t>
-            </w:r>
-          </w:p>
-        </w:tc>
-      </w:tr>
-      <w:tr>
-        <w:trPr>
-          <w:jc w:val="center"/>
-        </w:trPr>
-        <w:tc>
-          <w:tcPr>
-            <w:tcW w:w="3324" w:type="dxa"/>
-            <w:tcBorders>
-              <w:top w:val="single" w:sz="6" w:space="0" w:color="BFB3A0"/>
-              <w:left w:val="single" w:sz="6" w:space="0" w:color="BFB3A0"/>
-              <w:bottom w:val="single" w:sz="6" w:space="0" w:color="BFB3A0"/>
-              <w:right w:val="single" w:sz="6" w:space="0" w:color="BFB3A0"/>
-            </w:tcBorders>
-            <w:tcMar>
-              <w:top w:w="90" w:type="dxa"/>
-              <w:left w:w="90" w:type="dxa"/>
-              <w:bottom w:w="90" w:type="dxa"/>
-              <w:right w:w="90" w:type="dxa"/>
-            </w:tcMar>
-            <w:vAlign w:val="center"/>
-          </w:tcPr>
-          <w:p>
-            <w:pPr>
-              <w:spacing w:line="240" w:lineRule="auto"/>
-              <w:ind w:firstLine="0"/>
-              <w:jc w:val="left"/>
-            </w:pPr>
-            <w:proofErr w:type="spellStart"/>
-            <w:r>
-              <w:rPr>
-                <w:sz w:val="24"/>
-              </w:rPr>
-              <w:t>Атмосфера</w:t>
-            </w:r>
-            <w:proofErr w:type="spellEnd"/>
-            <w:r>
-              <w:rPr>
-                <w:sz w:val="24"/>
-              </w:rPr>
-              <w:t xml:space="preserve"> и </w:t>
-            </w:r>
-            <w:proofErr w:type="spellStart"/>
-            <w:r>
-              <w:rPr>
-                <w:sz w:val="24"/>
-              </w:rPr>
-              <w:t>вайб</w:t>
-            </w:r>
-            <w:proofErr w:type="spellEnd"/>
-          </w:p>
-        </w:tc>
-        <w:tc>
-          <w:tcPr>
-            <w:tcW w:w="3324" w:type="dxa"/>
-            <w:tcBorders>
-              <w:top w:val="single" w:sz="6" w:space="0" w:color="BFB3A0"/>
-              <w:left w:val="single" w:sz="6" w:space="0" w:color="BFB3A0"/>
-              <w:bottom w:val="single" w:sz="6" w:space="0" w:color="BFB3A0"/>
-              <w:right w:val="single" w:sz="6" w:space="0" w:color="BFB3A0"/>
-            </w:tcBorders>
-            <w:tcMar>
-              <w:top w:w="90" w:type="dxa"/>
-              <w:left w:w="90" w:type="dxa"/>
-              <w:bottom w:w="90" w:type="dxa"/>
-              <w:right w:w="90" w:type="dxa"/>
-            </w:tcMar>
-            <w:vAlign w:val="center"/>
-          </w:tcPr>
-          <w:p>
-            <w:pPr>
-              <w:spacing w:line="240" w:lineRule="auto"/>
-              <w:ind w:firstLine="0"/>
-              <w:jc w:val="left"/>
-              <w:rPr>
-                <w:lang w:val="ru-RU"/>
-              </w:rPr>
-            </w:pPr>
-            <w:r>
-              <w:rPr>
-                <w:sz w:val="24"/>
-                <w:lang w:val="ru-RU"/>
-              </w:rPr>
-              <w:t xml:space="preserve">Отражает цельность эмоционального впечатления и способность релиза </w:t>
-            </w:r>
-            <w:r>
-              <w:rPr>
-                <w:sz w:val="24"/>
-                <w:lang w:val="ru-RU"/>
-              </w:rPr>
-              <w:lastRenderedPageBreak/>
-              <w:t>удерживать настроение</w:t>
-            </w:r>
-          </w:p>
-        </w:tc>
-        <w:tc>
-          <w:tcPr>
-            <w:tcW w:w="3324" w:type="dxa"/>
-            <w:tcBorders>
-              <w:top w:val="single" w:sz="6" w:space="0" w:color="BFB3A0"/>
-              <w:left w:val="single" w:sz="6" w:space="0" w:color="BFB3A0"/>
-              <w:bottom w:val="single" w:sz="6" w:space="0" w:color="BFB3A0"/>
-              <w:right w:val="single" w:sz="6" w:space="0" w:color="BFB3A0"/>
-            </w:tcBorders>
-            <w:tcMar>
-              <w:top w:w="90" w:type="dxa"/>
-              <w:left w:w="90" w:type="dxa"/>
-              <w:bottom w:w="90" w:type="dxa"/>
-              <w:right w:w="90" w:type="dxa"/>
-            </w:tcMar>
-            <w:vAlign w:val="center"/>
-          </w:tcPr>
-          <w:p>
-            <w:pPr>
-              <w:spacing w:line="240" w:lineRule="auto"/>
-              <w:ind w:firstLine="0"/>
-              <w:jc w:val="left"/>
-              <w:rPr>
-                <w:lang w:val="ru-RU"/>
-              </w:rPr>
-            </w:pPr>
-            <w:r>
-              <w:rPr>
-                <w:sz w:val="24"/>
-                <w:lang w:val="ru-RU"/>
-              </w:rPr>
-              <w:lastRenderedPageBreak/>
               <w:t xml:space="preserve">Используется как </w:t>
             </w:r>
             <w:proofErr w:type="spellStart"/>
@@ -6972,11 +6869,24 @@
         </w:rPr>
         <w:t xml:space="preserve">В профиле пользователя блок уровня объединяет текущий ранг, количество баллов, место в общем рейтинге и ссылку на глоссарий геймификации. </w:t>
       </w:r>
-      <w:r>
-        <w:t xml:space="preserve">Пример такого </w:t>
-      </w:r>
       <w:proofErr w:type="spellStart"/>
       <w:r>
+        <w:t>Пример</w:t>
+      </w:r>
+      <w:proofErr w:type="spellEnd"/>
+      <w:r>
+        <w:t xml:space="preserve"> </w:t>
+      </w:r>
+      <w:proofErr w:type="spellStart"/>
+      <w:r>
+        <w:t>такого</w:t>
+      </w:r>
+      <w:proofErr w:type="spellEnd"/>
+      <w:r>
+        <w:t xml:space="preserve"> </w:t>
+      </w:r>
+      <w:proofErr w:type="spellStart"/>
+      <w:r>
         <w:t>блока</w:t>
       </w:r>
       <w:proofErr w:type="spellEnd"/>
@@ -6997,7 +6907,15 @@
       </w:r>
       <w:proofErr w:type="spellEnd"/>
       <w:r>
-        <w:t xml:space="preserve"> рисунке 15.</w:t>
+        <w:t xml:space="preserve"> </w:t>
+      </w:r>
+      <w:proofErr w:type="spellStart"/>
+      <w:r>
+        <w:t>рисунке</w:t>
+      </w:r>
+      <w:proofErr w:type="spellEnd"/>
+      <w:r>
+        <w:t xml:space="preserve"> 15.</w:t>
       </w:r>
     </w:p>
     <w:p>
@@ -7079,11 +6997,24 @@
         </w:rPr>
         <w:t xml:space="preserve">Глоссарий уровней и книга достижений раскрывают правила системы в более подробном виде. Пользователь может увидеть все уровни, способы получения опыта и список достижений, включая еще не открытые. </w:t>
       </w:r>
-      <w:r>
-        <w:t xml:space="preserve">Пример такого </w:t>
-      </w:r>
       <w:proofErr w:type="spellStart"/>
       <w:r>
+        <w:t>Пример</w:t>
+      </w:r>
+      <w:proofErr w:type="spellEnd"/>
+      <w:r>
+        <w:t xml:space="preserve"> </w:t>
+      </w:r>
+      <w:proofErr w:type="spellStart"/>
+      <w:r>
+        <w:t>такого</w:t>
+      </w:r>
+      <w:proofErr w:type="spellEnd"/>
+      <w:r>
+        <w:t xml:space="preserve"> </w:t>
+      </w:r>
+      <w:proofErr w:type="spellStart"/>
+      <w:r>
         <w:t>раздела</w:t>
       </w:r>
       <w:proofErr w:type="spellEnd"/>
@@ -7104,7 +7035,15 @@
       </w:r>
       <w:proofErr w:type="spellEnd"/>
       <w:r>
-        <w:t xml:space="preserve"> рисунке 16.</w:t>
+        <w:t xml:space="preserve"> </w:t>
+      </w:r>
+      <w:proofErr w:type="spellStart"/>
+      <w:r>
+        <w:t>рисунке</w:t>
+      </w:r>
+      <w:proofErr w:type="spellEnd"/>
+      <w:r>
+        <w:t xml:space="preserve"> 16.</w:t>
       </w:r>
     </w:p>
     <w:p>
@@ -18221,6 +18160,8 @@
     <w:p>
       <w:pPr>
         <w:pStyle w:val="1"/>
+        <w:ind w:firstLine="0"/>
+        <w:jc w:val="center"/>
         <w:rPr>
           <w:lang w:val="ru-RU"/>
         </w:rPr>
@@ -18514,6 +18455,8 @@
     <w:p>
       <w:pPr>
         <w:pStyle w:val="1"/>
+        <w:ind w:firstLine="0"/>
+        <w:jc w:val="center"/>
         <w:rPr>
           <w:lang w:val="ru-RU"/>
         </w:rPr>
@@ -18591,6 +18534,8 @@
     <w:p>
       <w:pPr>
         <w:pStyle w:val="1"/>
+        <w:ind w:firstLine="0"/>
+        <w:jc w:val="center"/>
         <w:rPr>
           <w:lang w:val="ru-RU"/>
         </w:rPr>
@@ -18601,7 +18546,7 @@
           <w:lang w:val="ru-RU"/>
         </w:rPr>
         <w:lastRenderedPageBreak/>
-        <w:t xml:space="preserve">ПРИЛОЖЕНИЕ А. СТРУКТУРА </w:t>
+        <w:t xml:space="preserve">ПРИЛОЖЕНИЕ А СТРУКТУРА </w:t>
       </w:r>
       <w:r>
         <w:rPr>
@@ -18664,6 +18609,8 @@
     <w:p>
       <w:pPr>
         <w:pStyle w:val="1"/>
+        <w:ind w:firstLine="0"/>
+        <w:jc w:val="center"/>
         <w:rPr>
           <w:lang w:val="ru-RU"/>
         </w:rPr>
@@ -18674,7 +18621,7 @@
           <w:lang w:val="ru-RU"/>
         </w:rPr>
         <w:lastRenderedPageBreak/>
-        <w:t>ПРИЛОЖЕНИЕ Б. ЛИСТИНГ МОДЕЛЕЙ БАЗЫ ДАННЫХ</w:t>
+        <w:t>ПРИЛОЖЕНИЕ Б ЛИСТИНГ МОДЕЛЕЙ БАЗЫ ДАННЫХ</w:t>
       </w:r>
     </w:p>
     <w:p>
@@ -18742,6 +18689,8 @@
     <w:p>
       <w:pPr>
         <w:pStyle w:val="1"/>
+        <w:ind w:firstLine="0"/>
+        <w:jc w:val="center"/>
         <w:rPr>
           <w:lang w:val="ru-RU"/>
         </w:rPr>
@@ -18752,7 +18701,7 @@
           <w:lang w:val="ru-RU"/>
         </w:rPr>
         <w:lastRenderedPageBreak/>
-        <w:t xml:space="preserve">ПРИЛОЖЕНИЕ В. КОНФИГУРАЦИЯ </w:t>
+        <w:t xml:space="preserve">ПРИЛОЖЕНИЕ В КОНФИГУРАЦИЯ </w:t>
       </w:r>
       <w:r>
         <w:rPr>
@@ -18861,6 +18810,8 @@
     <w:p>
       <w:pPr>
         <w:pStyle w:val="1"/>
+        <w:ind w:firstLine="0"/>
+        <w:jc w:val="center"/>
         <w:rPr>
           <w:lang w:val="ru-RU"/>
         </w:rPr>
@@ -18871,7 +18822,7 @@
           <w:lang w:val="ru-RU"/>
         </w:rPr>
         <w:lastRenderedPageBreak/>
-        <w:t xml:space="preserve">ПРИЛОЖЕНИЕ Г. КОНФИГУРАЦИЯ </w:t>
+        <w:t xml:space="preserve">ПРИЛОЖЕНИЕ Г КОНФИГУРАЦИЯ </w:t>
       </w:r>
       <w:r>
         <w:rPr>

</xml_diff>